<commit_message>
ADNOCLS: bibliography delivered, and impossible dates made impossible
Every one of the 591 inputs is rendered in the register, grouped by research
layer, with 15 judgements each carrying what would overturn it, 7 negative
results and 3 source discrepancies.

Twelve quarter-tag dates were not calendar dates at all — the construction
produced 30 June as the 31st. They are corrected, and compute.py now parses
every input date before it writes, so a date nobody could look up fails the
build rather than reaching a reader.

Co-Authored-By: Claude Fable 5 <noreply@anthropic.com>
Claude-Session: https://claude.ai/code/session_01FX6uP9o59mB1WpgL9CePqV
</commit_message>
<xml_diff>
--- a/engine/adnocls_study/ADNOCLS_Valuation_Study_09-08-2026_public.docx
+++ b/engine/adnocls_study/ADNOCLS_Valuation_Study_09-08-2026_public.docx
@@ -49,6 +49,7 @@
     </w:p>
     <w:p>
       <w:pPr>
+        <w:keepNext/>
         <w:spacing w:after="80" w:before="200"/>
       </w:pPr>
       <w:r>
@@ -63,6 +64,7 @@
     </w:p>
     <w:p>
       <w:pPr>
+        <w:keepNext/>
         <w:spacing w:after="120" w:before="280"/>
       </w:pPr>
       <w:r>
@@ -207,6 +209,7 @@
     </w:p>
     <w:p>
       <w:pPr>
+        <w:keepNext/>
         <w:spacing w:after="80" w:before="200"/>
       </w:pPr>
       <w:r>
@@ -272,11 +275,12 @@
           <w:color w:val="1C3A36"/>
           <w:sz w:val="21"/>
         </w:rPr>
-        <w:t>This study says they do not hold, and prices the fleet reverting over five years to the average of what it earned in FY2024 and FY2025. That is a judgement, and section 1.7 sets out the outside evidence for it. On that base, and on the share's own regressed beta, the four lenses centre at AED 7.94 against a market price of 6.16 — the price sits +29% the central estimate. Price the same cash flows at an asset-risk beta of one and the centre falls to AED 7.04, which is within a few fils of the market. The gap between those two numbers, AED 2.24 a share on the cash-flow lens alone, is larger than the entire span of the tanker-rate sensitivity. This study therefore does not present one answer; it presents the two answers and says exactly what separates them.</w:t>
+        <w:t>This study says they do not hold, and prices the fleet reverting over five years to the average of what it earned in FY2024 and FY2025. That is a judgement, and section 1.7 sets out the outside evidence for it. On that base, and on the share's own regressed beta, the four lenses centre at AED 7.94 against a market price of 6.16 — the central estimate sits +29% above the market price, or equivalently the price sits -22% against that estimate. Price the same cash flows at an asset-risk beta of one and the centre falls to AED 7.04, which is within a few fils of the market. The gap between those two numbers, AED 2.24 a share on the cash-flow lens alone, is about the same size as moving the whole tanker-rate anchor across its tested range, and less than half of what the beta alone moves across the range tested in section 1.9. This study therefore does not present one answer; it presents the two answers and says exactly what separates them.</w:t>
       </w:r>
     </w:p>
     <w:p>
       <w:pPr>
+        <w:keepNext/>
         <w:spacing w:after="80" w:before="200"/>
       </w:pPr>
       <w:r>
@@ -1398,6 +1402,7 @@
     </w:p>
     <w:p>
       <w:pPr>
+        <w:keepNext/>
         <w:spacing w:after="80" w:before="200"/>
       </w:pPr>
       <w:r>
@@ -2009,6 +2014,7 @@
     </w:p>
     <w:p>
       <w:pPr>
+        <w:keepNext/>
         <w:spacing w:after="120" w:before="280"/>
       </w:pPr>
       <w:r>
@@ -2023,6 +2029,7 @@
     </w:p>
     <w:p>
       <w:pPr>
+        <w:keepNext/>
         <w:spacing w:after="80" w:before="200"/>
       </w:pPr>
       <w:r>
@@ -3684,7 +3691,7 @@
                 <w:color w:val="1C3A36"/>
                 <w:sz w:val="16"/>
               </w:rPr>
-              <w:t>Free cash flow discounted</w:t>
+              <w:t>Free cash flow from the valuation date</w:t>
             </w:r>
           </w:p>
         </w:tc>
@@ -4149,6 +4156,7 @@
     </w:p>
     <w:p>
       <w:pPr>
+        <w:keepNext/>
         <w:spacing w:after="80" w:before="200"/>
       </w:pPr>
       <w:r>
@@ -5152,6 +5160,7 @@
     </w:p>
     <w:p>
       <w:pPr>
+        <w:keepNext/>
         <w:spacing w:after="80" w:before="200"/>
       </w:pPr>
       <w:r>
@@ -5175,7 +5184,7 @@
           <w:color w:val="1C3A36"/>
           <w:sz w:val="21"/>
         </w:rPr>
-        <w:t>One choice in the construction above moves the answer more than every operating assumption in the study combined: which beta belongs in the cost of equity. The share's own weekly returns, regressed against an equal-weight index of the Abu Dhabi names in this study's price library over its full listed history, give 0.705 — with 163 observations, an R-squared of 0.172, a standard error of 0.122 and a 90% interval of [0.50, 0.90]. That is a usable estimate and it is economically coherent: a listed crude and product tanker owner would normally sit at 0.9-1.4, a contracted marine services provider at 0.5-0.9, and this company is half of each. The opposing view is that a fleet owner bears the risk of the market its ships trade in whoever signs the charter, that three years of price history is a thin basis for a permanent discount rate, and that the equity should therefore be priced at a beta of one. Both are defensible. Both are computed.</w:t>
+        <w:t>One choice in the construction above moves the answer further than any operating assumption in the study: which beta belongs in the cost of equity. The share's own weekly returns, regressed against an equal-weight index of the Abu Dhabi names in this study's price library over its full listed history, give 0.705 — with 163 observations, an R-squared of 0.172, a standard error of 0.122 and a 90% interval of [0.50, 0.90]. That is a usable estimate and it is economically coherent: a listed crude and product tanker owner would normally sit at 0.9-1.4, a contracted marine services provider at 0.5-0.9, and this company is half of each. The opposing view is that a fleet owner bears the risk of the market its ships trade in whoever signs the charter, that three years of price history is a thin basis for a permanent discount rate, and that the equity should therefore be priced at a beta of one. Both are defensible. Both are computed.</w:t>
       </w:r>
     </w:p>
     <w:tbl>
@@ -5940,6 +5949,7 @@
     </w:p>
     <w:p>
       <w:pPr>
+        <w:keepNext/>
         <w:spacing w:after="80" w:before="200"/>
       </w:pPr>
       <w:r>
@@ -6516,6 +6526,7 @@
     </w:p>
     <w:p>
       <w:pPr>
+        <w:keepNext/>
         <w:spacing w:after="80" w:before="200"/>
       </w:pPr>
       <w:r>
@@ -7800,6 +7811,7 @@
     </w:p>
     <w:p>
       <w:pPr>
+        <w:keepNext/>
         <w:spacing w:after="80" w:before="200"/>
       </w:pPr>
       <w:r>
@@ -8258,7 +8270,7 @@
                 <w:color w:val="1C3A36"/>
                 <w:sz w:val="16"/>
               </w:rPr>
-              <w:t>Enterprise value of the operations</w:t>
+              <w:t>Sum of the three legs</w:t>
             </w:r>
           </w:p>
         </w:tc>
@@ -8337,7 +8349,7 @@
                 <w:color w:val="1C3A36"/>
                 <w:sz w:val="16"/>
               </w:rPr>
-              <w:t>the three legs added</w:t>
+              <w:t>enterprise value of the operations, the three legs added</w:t>
             </w:r>
           </w:p>
         </w:tc>
@@ -8806,7 +8818,7 @@
                 <w:color w:val="1C3A36"/>
                 <w:sz w:val="16"/>
               </w:rPr>
-              <w:t>AED 9.44 a share (+53% the market price)</w:t>
+              <w:t>AED 9.44 a share, 53% above the market price</w:t>
             </w:r>
           </w:p>
         </w:tc>
@@ -8833,6 +8845,7 @@
     </w:p>
     <w:p>
       <w:pPr>
+        <w:keepNext/>
         <w:spacing w:after="80" w:before="200"/>
       </w:pPr>
       <w:r>
@@ -9315,6 +9328,7 @@
     </w:p>
     <w:p>
       <w:pPr>
+        <w:keepNext/>
         <w:spacing w:after="80" w:before="200"/>
       </w:pPr>
       <w:r>
@@ -10361,6 +10375,7 @@
     </w:p>
     <w:p>
       <w:pPr>
+        <w:keepNext/>
         <w:spacing w:after="80" w:before="200"/>
       </w:pPr>
       <w:r>
@@ -10389,6 +10404,7 @@
     </w:p>
     <w:p>
       <w:pPr>
+        <w:keepNext/>
         <w:spacing w:after="80" w:before="200"/>
       </w:pPr>
       <w:r>
@@ -11813,6 +11829,7 @@
     </w:p>
     <w:p>
       <w:pPr>
+        <w:keepNext/>
         <w:spacing w:after="80" w:before="200"/>
       </w:pPr>
       <w:r>
@@ -12176,6 +12193,7 @@
     </w:p>
     <w:p>
       <w:pPr>
+        <w:keepNext/>
         <w:spacing w:after="80" w:before="200"/>
       </w:pPr>
       <w:r>
@@ -13458,6 +13476,7 @@
     </w:p>
     <w:p>
       <w:pPr>
+        <w:keepNext/>
         <w:spacing w:after="80" w:before="200"/>
       </w:pPr>
       <w:r>
@@ -14130,6 +14149,7 @@
     </w:p>
     <w:p>
       <w:pPr>
+        <w:keepNext/>
         <w:spacing w:after="80" w:before="200"/>
       </w:pPr>
       <w:r>
@@ -15176,6 +15196,7 @@
     </w:p>
     <w:p>
       <w:pPr>
+        <w:keepNext/>
         <w:spacing w:after="80" w:before="200"/>
       </w:pPr>
       <w:r>
@@ -15420,11 +15441,12 @@
           <w:color w:val="1C3A36"/>
           <w:sz w:val="21"/>
         </w:rPr>
-        <w:t>One more comparison puts the crux in proportion. Moving the mid-cycle rate anchor across the whole tested range, from 80.0% to 120.0% of the base, moves fair value by AED 2.43 a share. Changing the beta from the share's own 0.705 to an asset-risk one moves it by AED 2.24. The discount-rate judgement is 0.9 times the whole operating crux, which is an uncomfortable thing for a valuation to be true of and is stated rather than buried. It is also the reason both are published and neither is averaged.</w:t>
+        <w:t>One more comparison puts the crux in proportion. Moving the mid-cycle rate anchor across the whole tested range, from 80.0% to 120.0% of the base, moves fair value by AED 2.43 a share. Changing the beta from the share's own 0.705 to an asset-risk one moves it by AED 2.24 — the same order of magnitude, so the two published constructions of the discount rate differ by about as much as the whole operating crux. Widen the beta to the range actually tested in section 1.9, 0.50 to 1.20, and it moves fair value by AED 5.78, which is 2.4 times the rate anchor and the widest single sensitivity in the study. That a discount-rate input rivals and then exceeds the operating question is uncomfortable for a valuation, and it is stated rather than buried. It is also the reason both constructions are published and neither is averaged.</w:t>
       </w:r>
     </w:p>
     <w:p>
       <w:pPr>
+        <w:keepNext/>
         <w:spacing w:after="80" w:before="200"/>
       </w:pPr>
       <w:r>
@@ -16493,6 +16515,7 @@
     </w:p>
     <w:p>
       <w:pPr>
+        <w:keepNext/>
         <w:spacing w:after="80" w:before="200"/>
       </w:pPr>
       <w:r>
@@ -17044,6 +17067,7 @@
     </w:p>
     <w:p>
       <w:pPr>
+        <w:keepNext/>
         <w:spacing w:after="80" w:before="200"/>
       </w:pPr>
       <w:r>
@@ -17304,7 +17328,7 @@
                 <w:color w:val="1C3A36"/>
                 <w:sz w:val="15"/>
               </w:rPr>
-              <w:t>AED 8.64 (0.24)</w:t>
+              <w:t>AED 8.64, +0.24 against 8.40</w:t>
             </w:r>
           </w:p>
         </w:tc>
@@ -17553,6 +17577,7 @@
     </w:p>
     <w:p>
       <w:pPr>
+        <w:keepNext/>
         <w:spacing w:after="80" w:before="200"/>
       </w:pPr>
       <w:r>
@@ -18841,6 +18866,7 @@
     </w:p>
     <w:p>
       <w:pPr>
+        <w:keepNext/>
         <w:spacing w:after="120" w:before="280"/>
       </w:pPr>
       <w:r>
@@ -19109,7 +19135,7 @@
                 <w:color w:val="1C3A36"/>
                 <w:sz w:val="16"/>
               </w:rPr>
-              <w:t>price is -0% against it; the average is rising</w:t>
+              <w:t>price is -0.5% against it; the average is rising</w:t>
             </w:r>
           </w:p>
         </w:tc>
@@ -19167,7 +19193,7 @@
                 <w:color w:val="1C3A36"/>
                 <w:sz w:val="16"/>
               </w:rPr>
-              <w:t>price is +2% against it; the average is rising</w:t>
+              <w:t>price is +2.1% against it; the average is rising</w:t>
             </w:r>
           </w:p>
         </w:tc>
@@ -19225,7 +19251,7 @@
                 <w:color w:val="1C3A36"/>
                 <w:sz w:val="16"/>
               </w:rPr>
-              <w:t>price is +8% against it; the average is flat</w:t>
+              <w:t>price is +8.0% against it; the average is flat</w:t>
             </w:r>
           </w:p>
         </w:tc>
@@ -19672,6 +19698,7 @@
     </w:p>
     <w:p>
       <w:pPr>
+        <w:keepNext/>
         <w:spacing w:after="120" w:before="280"/>
       </w:pPr>
       <w:r>
@@ -19709,7 +19736,7 @@
           <w:color w:val="1C3A36"/>
           <w:sz w:val="21"/>
         </w:rPr>
-        <w:t>The widths are tested rather than assumed, and the test is worth stating in plain terms. Over the share's listed history the three-month distributions scored +2.95% better than a random-walk benchmark anchored on the same cost of carry, across 8 independent non-overlapping windows with origins from 2024-06-21 to 2026-03-24, each one forecast using only data available before it. Outcomes fell across the distribution roughly evenly rather than bunching at one end: a uniformity test on where each outcome landed returns p = 0.64, and a second test of the same thing returns p = 0.53. Coverage was 38% inside the 50% band, 75% inside the 80% and 88% inside the 90% — close to advertised at the wide bands, light at the narrow one on a sample of only 8 windows. The one-month horizon has more windows and behaves better: 24 of them, coverage 67% / 88% / 96%, uniformity p = 0.48, and a score +0.03% against the benchmark — level with it rather than ahead of it. Pooling 91 overlapping three-month windows on a shifted grid gives +0.66% and coverage of 52% / 84% / 96%.</w:t>
+        <w:t>The widths are tested rather than assumed, and the test is worth stating in plain terms. Over the share's listed history the three-month distributions scored +2.95% better than a random-walk benchmark anchored on the same cost of carry, across 8 independent non-overlapping windows with origins from 2024-06-21 to 2026-03-24, each one forecast using only data available before it. Outcomes fell across the distribution roughly evenly rather than bunching at one end: a uniformity test on where each outcome landed returns p = 0.64, and a second test of the same thing returns p = 0.53. Coverage was 38% inside the 50% band, 75% inside the 80% and 88% inside the 90% — close to advertised at the wide bands, light at the narrow one on a sample of only 8 windows. The one-month horizon has more windows and behaves better: 24 of them, coverage 67% / 88% / 96%, uniformity p = 0.48, and a score +0.03% against the benchmark — level with it rather than ahead of it. Pooling 91 three-month windows that start on staggered dates and therefore overlap one another gives +0.66% and coverage of 52% / 84% / 96% — a larger sample, but one whose windows are not independent of each other, so it corroborates the picture rather than adding new evidence to it.</w:t>
       </w:r>
     </w:p>
     <w:p>
@@ -19796,6 +19823,7 @@
     </w:p>
     <w:p>
       <w:pPr>
+        <w:keepNext/>
         <w:spacing w:after="80" w:before="200"/>
       </w:pPr>
       <w:r>
@@ -20368,6 +20396,7 @@
     </w:p>
     <w:p>
       <w:pPr>
+        <w:keepNext/>
         <w:spacing w:after="80" w:before="200"/>
       </w:pPr>
       <w:r>
@@ -20724,6 +20753,7 @@
     </w:p>
     <w:p>
       <w:pPr>
+        <w:keepNext/>
         <w:spacing w:after="120" w:before="280"/>
       </w:pPr>
       <w:r>
@@ -20860,7 +20890,7 @@
                 <w:color w:val="1C3A36"/>
                 <w:sz w:val="16"/>
               </w:rPr>
-              <w:t>AED 7.94, +29% against the market</w:t>
+              <w:t>AED 7.94, 29% above the market price</w:t>
             </w:r>
           </w:p>
         </w:tc>
@@ -21380,6 +21410,7 @@
     </w:p>
     <w:p>
       <w:pPr>
+        <w:keepNext/>
         <w:spacing w:after="120" w:before="280"/>
       </w:pPr>
       <w:r>
@@ -21938,6 +21969,7 @@
     </w:p>
     <w:p>
       <w:pPr>
+        <w:keepNext/>
         <w:spacing w:after="120" w:before="280"/>
       </w:pPr>
       <w:r>
@@ -22411,6 +22443,7 @@
     </w:p>
     <w:p>
       <w:pPr>
+        <w:keepNext/>
         <w:spacing w:after="120" w:before="280"/>
       </w:pPr>
       <w:r>
@@ -22441,7 +22474,7 @@
           <w:color w:val="1C3A36"/>
           <w:sz w:val="21"/>
         </w:rPr>
-        <w:t>The difference between the share's own regressed beta of 0.705 and an asset-risk beta of one is AED 2.24 a share on the cash-flow lens — larger than the entire tanker-rate sensitivity, larger than the capital programme, larger than the tax exposure. The regression is real and passes its usability conditions, but it rests on 3.2 years of history in a period when the contracted arm was growing faster than the merchant fleet. Both readings are published as equals. If forced to say which way the evidence leans: the market price sits on the asset-beta reading.</w:t>
+        <w:t>The difference between the share's own regressed beta of 0.705 and an asset-risk beta of one is AED 2.24 a share on the cash-flow lens — larger than the capital-expenditure row and the tax row, and about the same size as moving the tanker-rate anchor across its whole tested range. Across the beta range tested in section 1.9 the swing is AED 5.78, the widest single sensitivity in the study. The regression is real and passes its usability conditions, but it rests on 3.2 years of history in a period when the contracted arm was growing faster than the merchant fleet. Both readings are published as equals. If forced to say which way the evidence leans: the market price sits on the asset-beta reading.</w:t>
       </w:r>
     </w:p>
     <w:p>
@@ -22690,6 +22723,7 @@
     </w:p>
     <w:p>
       <w:pPr>
+        <w:keepNext/>
         <w:spacing w:after="120" w:before="280"/>
       </w:pPr>
       <w:r>
@@ -22704,6 +22738,7 @@
     </w:p>
     <w:p>
       <w:pPr>
+        <w:keepNext/>
         <w:spacing w:after="80" w:before="200"/>
       </w:pPr>
       <w:r>
@@ -25990,6 +26025,7 @@
     </w:p>
     <w:p>
       <w:pPr>
+        <w:keepNext/>
         <w:spacing w:after="80" w:before="200"/>
       </w:pPr>
       <w:r>
@@ -29258,6 +29294,7 @@
     </w:p>
     <w:p>
       <w:pPr>
+        <w:keepNext/>
         <w:spacing w:after="80" w:before="200"/>
       </w:pPr>
       <w:r>
@@ -29785,7 +29822,7 @@
                 <w:color w:val="1C3A36"/>
                 <w:sz w:val="16"/>
               </w:rPr>
-              <w:t>Interest paid on the modelled debt</w:t>
+              <w:t>Interest on the modelled debt</w:t>
             </w:r>
           </w:p>
         </w:tc>
@@ -31046,6 +31083,7 @@
     </w:p>
     <w:p>
       <w:pPr>
+        <w:keepNext/>
         <w:spacing w:after="120" w:before="280"/>
       </w:pPr>
       <w:r>
@@ -31060,6 +31098,7 @@
     </w:p>
     <w:p>
       <w:pPr>
+        <w:keepNext/>
         <w:spacing w:after="80" w:before="200"/>
       </w:pPr>
       <w:r>
@@ -31496,6 +31535,7 @@
     </w:p>
     <w:p>
       <w:pPr>
+        <w:keepNext/>
         <w:spacing w:after="80" w:before="200"/>
       </w:pPr>
       <w:r>
@@ -31705,7 +31745,7 @@
                 <w:color w:val="1C3A36"/>
                 <w:sz w:val="16"/>
               </w:rPr>
-              <w:t>AED 2.24 a share — the largest single item in the study</w:t>
+              <w:t>AED 2.24 a share between the two published constructions, and AED 5.78 across the beta range tested in section 1.9 — the widest single sensitivity in the study</w:t>
             </w:r>
           </w:p>
         </w:tc>
@@ -32054,6 +32094,7 @@
     </w:p>
     <w:p>
       <w:pPr>
+        <w:keepNext/>
         <w:spacing w:after="80" w:before="200"/>
       </w:pPr>
       <w:r>
@@ -32912,6 +32953,7 @@
     </w:p>
     <w:p>
       <w:pPr>
+        <w:keepNext/>
         <w:spacing w:after="120" w:before="280"/>
       </w:pPr>
       <w:r>
@@ -32940,6 +32982,7 @@
     </w:p>
     <w:p>
       <w:pPr>
+        <w:keepNext/>
         <w:spacing w:after="80" w:before="200"/>
       </w:pPr>
       <w:r>
@@ -33650,6 +33693,7 @@
     </w:p>
     <w:p>
       <w:pPr>
+        <w:keepNext/>
         <w:spacing w:after="80" w:before="200"/>
       </w:pPr>
       <w:r>
@@ -34174,6 +34218,7 @@
     </w:p>
     <w:p>
       <w:pPr>
+        <w:keepNext/>
         <w:spacing w:after="80" w:before="200"/>
       </w:pPr>
       <w:r>
@@ -34893,7 +34938,7 @@
                 <w:color w:val="1C3A36"/>
                 <w:sz w:val="16"/>
               </w:rPr>
-              <w:t>Cost of capital that year</w:t>
+              <w:t>Cost of capital charged — the explicit-window rate, held flat</w:t>
             </w:r>
           </w:p>
         </w:tc>
@@ -34911,7 +34956,7 @@
                 <w:color w:val="1C3A36"/>
                 <w:sz w:val="16"/>
               </w:rPr>
-              <w:t>7.15%</w:t>
+              <w:t>7.31%</w:t>
             </w:r>
           </w:p>
         </w:tc>
@@ -34929,7 +34974,7 @@
                 <w:color w:val="1C3A36"/>
                 <w:sz w:val="16"/>
               </w:rPr>
-              <w:t>6.99%</w:t>
+              <w:t>7.31%</w:t>
             </w:r>
           </w:p>
         </w:tc>
@@ -34947,7 +34992,7 @@
                 <w:color w:val="1C3A36"/>
                 <w:sz w:val="16"/>
               </w:rPr>
-              <w:t>6.83%</w:t>
+              <w:t>7.31%</w:t>
             </w:r>
           </w:p>
         </w:tc>
@@ -34965,7 +35010,7 @@
                 <w:color w:val="1C3A36"/>
                 <w:sz w:val="16"/>
               </w:rPr>
-              <w:t>6.67%</w:t>
+              <w:t>7.31%</w:t>
             </w:r>
           </w:p>
         </w:tc>
@@ -34983,7 +35028,7 @@
                 <w:color w:val="1C3A36"/>
                 <w:sz w:val="16"/>
               </w:rPr>
-              <w:t>6.51%</w:t>
+              <w:t>7.31%</w:t>
             </w:r>
           </w:p>
         </w:tc>
@@ -35129,7 +35174,7 @@
                 <w:color w:val="1C3A36"/>
                 <w:sz w:val="16"/>
               </w:rPr>
-              <w:t>Economic profit (USD mn)</w:t>
+              <w:t>Economic profit — net operating profit after tax less the capital charge (USD mn)</w:t>
             </w:r>
           </w:p>
         </w:tc>
@@ -35241,7 +35286,7 @@
           <w:color w:val="6E7B77"/>
           <w:sz w:val="17"/>
         </w:rPr>
-        <w:t>This is the most revealing exhibit in the study. The spread is positive in every forecast year — the business earns 15% on capital in 2026E against a cost of 7% — and it narrows steadily as the rate cycle normalises and the capital base grows. That is a company creating value throughout, but creating less of it each year, which is a very different picture from either a compounder or a value destroyer. Note the convention: the return divides by closing invested capital, matching Appendix A.3, while economic profit charges the cost of capital on the same closing base, so the two rows are internally consistent. Note also that this leg's enterprise value of USD 17,177 million differs from the cash-flow model's USD 19,891 million: economic-profit and cash-flow valuations are algebraically identical on identical assumptions, and the gap here is entirely the different terminal treatment — a fading economic-profit perpetuity against a reinvestment-funded terminal value. Expert 3 is therefore a restatement of the cash-flow model under a different terminal discipline, not independent confirmation of it, and is read as such.</w:t>
+        <w:t>This is the most revealing exhibit in the study. The spread is positive in every forecast year — the business earns 15% on capital in 2026E against a cost of 7% — and it narrows steadily as the rate cycle normalises and the capital base grows. That is a company creating value throughout, but creating less of it each year, which is a very different picture from either a compounder or a value destroyer. Two conventions in this table are named so they cannot be confused with the ones used elsewhere. The return divides by closing invested capital, matching Appendix A.3; and the capital charge is the explicit-window cost of capital of 7.31% held flat across all five years rather than the declining schedule the cash-flow model discounts at, so the spread row is exactly the return row less 7.31% and the economic-profit row is exactly that spread on the same closing capital. Appendix A.3 shows the spread on the declining schedule instead, which is why the two tables give different spreads from the same returns. Note also that this leg's enterprise value of USD 17,177 million differs from the cash-flow model's USD 19,891 million: economic-profit and cash-flow valuations are algebraically identical on identical assumptions, and the gap here is entirely the different terminal treatment — a fading economic-profit perpetuity against a reinvestment-funded terminal value. Expert 3 is therefore a restatement of the cash-flow model under a different terminal discipline, not independent confirmation of it, and is read as such.</w:t>
       </w:r>
     </w:p>
     <w:p>
@@ -35274,6 +35319,7 @@
     </w:p>
     <w:p>
       <w:pPr>
+        <w:keepNext/>
         <w:spacing w:after="80" w:before="200"/>
       </w:pPr>
       <w:r>
@@ -35608,6 +35654,7 @@
     </w:p>
     <w:p>
       <w:pPr>
+        <w:keepNext/>
         <w:spacing w:after="80" w:before="200"/>
       </w:pPr>
       <w:r>
@@ -35699,11 +35746,12 @@
           <w:color w:val="1C3A36"/>
           <w:sz w:val="21"/>
         </w:rPr>
-        <w:t>The panel centre of AED 6.53 sits +6% against the market price and -18% against the study's own own-beta central. That gap is real and it has a single explanation: every one of the three experts works from mid-cycle or five-year-average earnings, and none of them capitalises a terminal value the way the cash-flow model does. The cash-flow model puts 84% of its enterprise value beyond the fifth year; the panel puts effectively none there. A reader who distrusts long terminal values should weight the panel; a reader who believes a contracted marine infrastructure business has a long life beyond a five-year window should weight the model. Both positions are defensible and the gap between them is stated at full size rather than smoothed.</w:t>
+        <w:t>The panel centre of AED 6.53 sits 6% above the market price and -18% against the study's own own-beta central. That gap is real and it has a single explanation: every one of the three experts works from mid-cycle or five-year-average earnings, and none of them capitalises a terminal value the way the cash-flow model does. The cash-flow model puts 84% of its enterprise value beyond the fifth year; the panel puts effectively none there. A reader who distrusts long terminal values should weight the panel; a reader who believes a contracted marine infrastructure business has a long life beyond a five-year window should weight the model. Both positions are defensible and the gap between them is stated at full size rather than smoothed.</w:t>
       </w:r>
     </w:p>
     <w:p>
       <w:pPr>
+        <w:keepNext/>
         <w:spacing w:after="80" w:before="200"/>
       </w:pPr>
       <w:r>
@@ -36318,6 +36366,7 @@
     </w:p>
     <w:p>
       <w:pPr>
+        <w:keepNext/>
         <w:spacing w:after="120" w:before="280"/>
       </w:pPr>
       <w:r>
@@ -36355,7 +36404,7 @@
           <w:color w:val="1C3A36"/>
           <w:sz w:val="21"/>
         </w:rPr>
-        <w:t>Where a judgement has two legitimate constructions, both are computed and both are published side by side. This study does that twice: for the cost of equity, which is the largest single item in it, and for the treatment of the perpetual capital securities. Neither pair is averaged, because an average of two constructions is a number that neither construction supports.</w:t>
+        <w:t>Where a judgement has two legitimate constructions, both are computed and both are published side by side. This study does that twice: for the cost of equity, which is the widest single sensitivity in it, and for the treatment of the perpetual capital securities. Neither pair is averaged, because an average of two constructions is a number that neither construction supports.</w:t>
       </w:r>
     </w:p>
     <w:p>
@@ -36369,11 +36418,12 @@
           <w:color w:val="1C3A36"/>
           <w:sz w:val="21"/>
         </w:rPr>
-        <w:t>The probabilistic price map in section 3 is produced by a volatility model that is tested by walk-forward simulation against a random-walk benchmark before it is allowed to publish a range. It describes price dispersion and carries no view on value. It is never combined with the fair-value work.</w:t>
+        <w:t>The probabilistic price map in section 3 is produced by a volatility model that is tested before it is allowed to publish a range: the model is re-run at successive past dates using only the data available on each of those dates, and every forecast it made is scored against what the price actually did, alongside a random-walk benchmark. It describes price dispersion and carries no view on value. It is never combined with the fair-value work.</w:t>
       </w:r>
     </w:p>
     <w:p>
       <w:pPr>
+        <w:keepNext/>
         <w:spacing w:after="120" w:before="280"/>
       </w:pPr>
       <w:r>

</xml_diff>